<commit_message>
luxury upgrade and api fix
</commit_message>
<xml_diff>
--- a/New Microsoft Word Document.docx
+++ b/New Microsoft Word Document.docx
@@ -24,15 +24,7 @@
     </w:p>
     <w:p>
       <w:r>
-        <w:t xml:space="preserve">Unopened and unused products may be requested for replacement within 15 days of purchase, provided the original seal, packaging, and invoice </w:t>
-      </w:r>
-      <w:proofErr w:type="gramStart"/>
-      <w:r>
-        <w:t>are</w:t>
-      </w:r>
-      <w:proofErr w:type="gramEnd"/>
-      <w:r>
-        <w:t xml:space="preserve"> intact. Used or tampered products will not be accepted.</w:t>
+        <w:t>Unopened and unused products may be requested for replacement within 15 days of purchase, provided the original seal, packaging, and invoice are intact. Used or tampered products will not be accepted.</w:t>
       </w:r>
     </w:p>
     <w:p>
@@ -199,23 +191,7 @@
           <w:b/>
           <w:bCs/>
         </w:rPr>
-        <w:t xml:space="preserve">Theme: "Royal Elegance." Use a </w:t>
-      </w:r>
-      <w:proofErr w:type="spellStart"/>
-      <w:r>
-        <w:rPr>
-          <w:b/>
-          <w:bCs/>
-        </w:rPr>
-        <w:t>color</w:t>
-      </w:r>
-      <w:proofErr w:type="spellEnd"/>
-      <w:r>
-        <w:rPr>
-          <w:b/>
-          <w:bCs/>
-        </w:rPr>
-        <w:t xml:space="preserve"> palette of Deep Emerald or Royal Navy, accented with Brushed Gold (#D4AF37) and Creamy Marble (#F5F5DC).</w:t>
+        <w:t>Theme: "Royal Elegance." Use a color palette of Deep Emerald or Royal Navy, accented with Brushed Gold (#D4AF37) and Creamy Marble (#F5F5DC).</w:t>
       </w:r>
     </w:p>
     <w:p>
@@ -460,31 +436,7 @@
           <w:lang w:eastAsia="en-GB"/>
           <w14:ligatures w14:val="none"/>
         </w:rPr>
-        <w:t xml:space="preserve"> "Royal Elegance." </w:t>
-      </w:r>
-      <w:proofErr w:type="spellStart"/>
-      <w:r>
-        <w:rPr>
-          <w:rFonts w:ascii="Times New Roman" w:eastAsia="Times New Roman" w:hAnsi="Times New Roman" w:cs="Times New Roman"/>
-          <w:kern w:val="0"/>
-          <w:sz w:val="24"/>
-          <w:szCs w:val="24"/>
-          <w:lang w:eastAsia="en-GB"/>
-          <w14:ligatures w14:val="none"/>
-        </w:rPr>
-        <w:t>Color</w:t>
-      </w:r>
-      <w:proofErr w:type="spellEnd"/>
-      <w:r>
-        <w:rPr>
-          <w:rFonts w:ascii="Times New Roman" w:eastAsia="Times New Roman" w:hAnsi="Times New Roman" w:cs="Times New Roman"/>
-          <w:kern w:val="0"/>
-          <w:sz w:val="24"/>
-          <w:szCs w:val="24"/>
-          <w:lang w:eastAsia="en-GB"/>
-          <w14:ligatures w14:val="none"/>
-        </w:rPr>
-        <w:t xml:space="preserve"> palette: </w:t>
+        <w:t xml:space="preserve"> "Royal Elegance." Color palette: </w:t>
       </w:r>
       <w:r>
         <w:rPr>
@@ -679,23 +631,7 @@
           <w:b/>
           <w:bCs/>
         </w:rPr>
-        <w:t>Routing: Use react-router-</w:t>
-      </w:r>
-      <w:proofErr w:type="spellStart"/>
-      <w:r>
-        <w:rPr>
-          <w:b/>
-          <w:bCs/>
-        </w:rPr>
-        <w:t>dom</w:t>
-      </w:r>
-      <w:proofErr w:type="spellEnd"/>
-      <w:r>
-        <w:rPr>
-          <w:b/>
-          <w:bCs/>
-        </w:rPr>
-        <w:t xml:space="preserve"> for the following pages:</w:t>
+        <w:t>Routing: Use react-router-dom for the following pages:</w:t>
       </w:r>
     </w:p>
     <w:p>
@@ -809,23 +745,7 @@
           <w:b/>
           <w:bCs/>
         </w:rPr>
-        <w:t xml:space="preserve">State Management: Implement a Fully Functional Shopping Cart using Redux Toolkit or React Context API (with </w:t>
-      </w:r>
-      <w:proofErr w:type="spellStart"/>
-      <w:r>
-        <w:rPr>
-          <w:b/>
-          <w:bCs/>
-        </w:rPr>
-        <w:t>LocalStorage</w:t>
-      </w:r>
-      <w:proofErr w:type="spellEnd"/>
-      <w:r>
-        <w:rPr>
-          <w:b/>
-          <w:bCs/>
-        </w:rPr>
-        <w:t xml:space="preserve"> persistence).</w:t>
+        <w:t>State Management: Implement a Fully Functional Shopping Cart using Redux Toolkit or React Context API (with LocalStorage persistence).</w:t>
       </w:r>
     </w:p>
     <w:p>
@@ -878,25 +798,7 @@
           <w:b/>
           <w:bCs/>
         </w:rPr>
-        <w:t xml:space="preserve">WhatsApp Button: A branded WhatsApp icon with a "Chat with Us" label. When clicked, it must trigger a </w:t>
-      </w:r>
-      <w:proofErr w:type="spellStart"/>
-      <w:proofErr w:type="gramStart"/>
-      <w:r>
-        <w:rPr>
-          <w:b/>
-          <w:bCs/>
-        </w:rPr>
-        <w:t>window.open</w:t>
-      </w:r>
-      <w:proofErr w:type="spellEnd"/>
-      <w:proofErr w:type="gramEnd"/>
-      <w:r>
-        <w:rPr>
-          <w:b/>
-          <w:bCs/>
-        </w:rPr>
-        <w:t xml:space="preserve"> or an &lt;a&gt; tag pointing to https://wa.me/917977287353 to open a direct chat.</w:t>
+        <w:t>WhatsApp Button: A branded WhatsApp icon with a "Chat with Us" label. When clicked, it must trigger a window.open or an &lt;a&gt; tag pointing to https://wa.me/917977287353 to open a direct chat.</w:t>
       </w:r>
     </w:p>
     <w:p>
@@ -915,39 +817,7 @@
           <w:b/>
           <w:bCs/>
         </w:rPr>
-        <w:t xml:space="preserve">Email Link: A professional mail icon (e.g., </w:t>
-      </w:r>
-      <w:proofErr w:type="spellStart"/>
-      <w:r>
-        <w:rPr>
-          <w:b/>
-          <w:bCs/>
-        </w:rPr>
-        <w:t>Lucide</w:t>
-      </w:r>
-      <w:proofErr w:type="spellEnd"/>
-      <w:r>
-        <w:rPr>
-          <w:b/>
-          <w:bCs/>
-        </w:rPr>
-        <w:t xml:space="preserve">-React or </w:t>
-      </w:r>
-      <w:proofErr w:type="spellStart"/>
-      <w:r>
-        <w:rPr>
-          <w:b/>
-          <w:bCs/>
-        </w:rPr>
-        <w:t>FontAwesome</w:t>
-      </w:r>
-      <w:proofErr w:type="spellEnd"/>
-      <w:r>
-        <w:rPr>
-          <w:b/>
-          <w:bCs/>
-        </w:rPr>
-        <w:t>) followed by the text samsungin123@gmail.com. Ensure it uses the mailto: protocol.</w:t>
+        <w:t>Email Link: A professional mail icon (e.g., Lucide-React or FontAwesome) followed by the text samsungin123@gmail.com. Ensure it uses the mailto: protocol.</w:t>
       </w:r>
     </w:p>
     <w:p>
@@ -1060,23 +930,7 @@
           <w:b/>
           <w:bCs/>
         </w:rPr>
-        <w:t>GET /</w:t>
-      </w:r>
-      <w:proofErr w:type="spellStart"/>
-      <w:r>
-        <w:rPr>
-          <w:b/>
-          <w:bCs/>
-        </w:rPr>
-        <w:t>api</w:t>
-      </w:r>
-      <w:proofErr w:type="spellEnd"/>
-      <w:r>
-        <w:rPr>
-          <w:b/>
-          <w:bCs/>
-        </w:rPr>
-        <w:t>/products (with search/filter logic).</w:t>
+        <w:t>GET /api/products (with search/filter logic).</w:t>
       </w:r>
     </w:p>
     <w:p>
@@ -1095,23 +949,7 @@
           <w:b/>
           <w:bCs/>
         </w:rPr>
-        <w:t>POST /</w:t>
-      </w:r>
-      <w:proofErr w:type="spellStart"/>
-      <w:r>
-        <w:rPr>
-          <w:b/>
-          <w:bCs/>
-        </w:rPr>
-        <w:t>api</w:t>
-      </w:r>
-      <w:proofErr w:type="spellEnd"/>
-      <w:r>
-        <w:rPr>
-          <w:b/>
-          <w:bCs/>
-        </w:rPr>
-        <w:t>/orders (to handle checkout submissions).</w:t>
+        <w:t>POST /api/orders (to handle checkout submissions).</w:t>
       </w:r>
     </w:p>
     <w:p>
@@ -1221,6 +1059,117 @@
           <w:bCs/>
         </w:rPr>
       </w:pPr>
+      <w:r>
+        <w:rPr>
+          <w:b/>
+          <w:bCs/>
+        </w:rPr>
+        <w:t>Cloudinary for image an</w:t>
+      </w:r>
+      <w:r>
+        <w:rPr>
+          <w:b/>
+          <w:bCs/>
+        </w:rPr>
+        <w:t>d</w:t>
+      </w:r>
+      <w:r>
+        <w:rPr>
+          <w:b/>
+          <w:bCs/>
+        </w:rPr>
+        <w:t xml:space="preserve"> media</w:t>
+      </w:r>
+      <w:r>
+        <w:rPr>
+          <w:b/>
+          <w:bCs/>
+        </w:rPr>
+        <w:t xml:space="preserve"> email used is </w:t>
+      </w:r>
+      <w:hyperlink r:id="rId5" w:history="1">
+        <w:r>
+          <w:rPr>
+            <w:rStyle w:val="Hyperlink"/>
+            <w:b/>
+            <w:bCs/>
+          </w:rPr>
+          <w:t>samsungin123@gmail.com</w:t>
+        </w:r>
+      </w:hyperlink>
+    </w:p>
+    <w:p>
+      <w:pPr>
+        <w:rPr>
+          <w:b/>
+          <w:bCs/>
+        </w:rPr>
+      </w:pPr>
+      <w:r>
+        <w:rPr>
+          <w:b/>
+          <w:bCs/>
+        </w:rPr>
+        <w:t>Admin User name :</w:t>
+      </w:r>
+      <w:r>
+        <w:t xml:space="preserve"> </w:t>
+      </w:r>
+      <w:hyperlink r:id="rId6" w:history="1">
+        <w:r>
+          <w:rPr>
+            <w:rStyle w:val="Hyperlink"/>
+            <w:b/>
+            <w:bCs/>
+          </w:rPr>
+          <w:t>admin@featherwhite.com</w:t>
+        </w:r>
+      </w:hyperlink>
+    </w:p>
+    <w:p>
+      <w:pPr>
+        <w:rPr>
+          <w:b/>
+          <w:bCs/>
+        </w:rPr>
+      </w:pPr>
+      <w:r>
+        <w:rPr>
+          <w:b/>
+          <w:bCs/>
+        </w:rPr>
+        <w:t>Pw: 123456</w:t>
+      </w:r>
+    </w:p>
+    <w:p>
+      <w:pPr>
+        <w:rPr>
+          <w:b/>
+          <w:bCs/>
+        </w:rPr>
+      </w:pPr>
+      <w:r>
+        <w:rPr>
+          <w:b/>
+          <w:bCs/>
+        </w:rPr>
+        <w:t xml:space="preserve">Google Cloud console for customer login </w:t>
+      </w:r>
+    </w:p>
+    <w:p>
+      <w:pPr>
+        <w:rPr>
+          <w:b/>
+          <w:bCs/>
+        </w:rPr>
+      </w:pPr>
+      <w:r>
+        <w:rPr>
+          <w:b/>
+          <w:bCs/>
+        </w:rPr>
+        <w:t>https://console.cloud.google.com/</w:t>
+      </w:r>
     </w:p>
     <w:sectPr>
       <w:pgSz w:w="11906" w:h="16838"/>
@@ -3083,6 +3032,29 @@
       <w14:ligatures w14:val="none"/>
     </w:rPr>
   </w:style>
+  <w:style w:type="character" w:styleId="Hyperlink">
+    <w:name w:val="Hyperlink"/>
+    <w:basedOn w:val="DefaultParagraphFont"/>
+    <w:uiPriority w:val="99"/>
+    <w:unhideWhenUsed/>
+    <w:rsid w:val="00EF7CBD"/>
+    <w:rPr>
+      <w:color w:val="0563C1" w:themeColor="hyperlink"/>
+      <w:u w:val="single"/>
+    </w:rPr>
+  </w:style>
+  <w:style w:type="character" w:styleId="UnresolvedMention">
+    <w:name w:val="Unresolved Mention"/>
+    <w:basedOn w:val="DefaultParagraphFont"/>
+    <w:uiPriority w:val="99"/>
+    <w:semiHidden/>
+    <w:unhideWhenUsed/>
+    <w:rsid w:val="00EF7CBD"/>
+    <w:rPr>
+      <w:color w:val="605E5C"/>
+      <w:shd w:val="clear" w:color="auto" w:fill="E1DFDD"/>
+    </w:rPr>
+  </w:style>
 </w:styles>
 </file>
 

</xml_diff>

<commit_message>
Implemented email verification and mobile fixes
</commit_message>
<xml_diff>
--- a/New Microsoft Word Document.docx
+++ b/New Microsoft Word Document.docx
@@ -65,10 +65,473 @@
     </w:p>
     <w:p>
       <w:r>
-        <w:rPr>
-          <w:b/>
-          <w:bCs/>
-        </w:rPr>
+        <w:t>Terms of services</w:t>
+      </w:r>
+    </w:p>
+    <w:p>
+      <w:r>
+        <w:t># Terms of Service</w:t>
+      </w:r>
+    </w:p>
+    <w:p/>
+    <w:p>
+      <w:r>
+        <w:t>**Feather White**</w:t>
+      </w:r>
+    </w:p>
+    <w:p/>
+    <w:p>
+      <w:r>
+        <w:t>**Last Updated:** [Insert Date]</w:t>
+      </w:r>
+    </w:p>
+    <w:p/>
+    <w:p>
+      <w:r>
+        <w:t>These Terms of Service (“Terms”) constitute a legally binding agreement between you (“User”, “you”) and Feather White (“Company”, “we”, “our”, “us”). By accessing or using our website, you agree to comply with and be bound by these Terms.</w:t>
+      </w:r>
+    </w:p>
+    <w:p/>
+    <w:p>
+      <w:r>
+        <w:t>---</w:t>
+      </w:r>
+    </w:p>
+    <w:p/>
+    <w:p>
+      <w:r>
+        <w:t>## 1. Eligibility</w:t>
+      </w:r>
+    </w:p>
+    <w:p/>
+    <w:p>
+      <w:r>
+        <w:t>By using this website, you confirm that you are at least 18 years of age or are using the website under the supervision of a parent or legal guardian.</w:t>
+      </w:r>
+    </w:p>
+    <w:p/>
+    <w:p>
+      <w:r>
+        <w:t>---</w:t>
+      </w:r>
+    </w:p>
+    <w:p/>
+    <w:p>
+      <w:r>
+        <w:t>## 2. Use of Website</w:t>
+      </w:r>
+    </w:p>
+    <w:p/>
+    <w:p>
+      <w:r>
+        <w:t>You agree to use this website strictly for lawful purposes. You shall not:</w:t>
+      </w:r>
+    </w:p>
+    <w:p/>
+    <w:p>
+      <w:r>
+        <w:lastRenderedPageBreak/>
+        <w:t>* Violate any applicable laws or regulations</w:t>
+      </w:r>
+    </w:p>
+    <w:p>
+      <w:r>
+        <w:t>* Engage in fraudulent, abusive, or harmful activity</w:t>
+      </w:r>
+    </w:p>
+    <w:p>
+      <w:r>
+        <w:t>* Attempt to gain unauthorized access to our systems</w:t>
+      </w:r>
+    </w:p>
+    <w:p/>
+    <w:p>
+      <w:r>
+        <w:t>We reserve the right to suspend or terminate access without notice for violations.</w:t>
+      </w:r>
+    </w:p>
+    <w:p/>
+    <w:p>
+      <w:r>
+        <w:t>---</w:t>
+      </w:r>
+    </w:p>
+    <w:p/>
+    <w:p>
+      <w:r>
+        <w:t>## 3. Product Nature &amp; Disclaimer</w:t>
+      </w:r>
+    </w:p>
+    <w:p/>
+    <w:p>
+      <w:r>
+        <w:t>All Feather White products are **cosmetic and personal care products for external use only**.</w:t>
+      </w:r>
+    </w:p>
+    <w:p/>
+    <w:p>
+      <w:r>
+        <w:t>* Products are **not medicines** and are **not intended to diagnose, treat, cure, or prevent any disease**</w:t>
+      </w:r>
+    </w:p>
+    <w:p>
+      <w:r>
+        <w:t>* Individual results may vary based on skin type, usage, and lifestyle</w:t>
+      </w:r>
+    </w:p>
+    <w:p>
+      <w:r>
+        <w:t>* Product descriptions, claims, and benefits are **for informational and marketing purposes only** and should not be interpreted as guarantees</w:t>
+      </w:r>
+    </w:p>
+    <w:p/>
+    <w:p>
+      <w:r>
+        <w:t>Users are advised to:</w:t>
+      </w:r>
+    </w:p>
+    <w:p/>
+    <w:p>
+      <w:r>
+        <w:t>* Perform a **patch test before use**</w:t>
+      </w:r>
+    </w:p>
+    <w:p>
+      <w:r>
+        <w:t>* Consult a qualified professional in case of allergies or sensitivities</w:t>
+      </w:r>
+    </w:p>
+    <w:p/>
+    <w:p>
+      <w:r>
+        <w:t>The Company shall not be liable for any adverse reactions due to misuse, negligence, or undisclosed conditions.</w:t>
+      </w:r>
+    </w:p>
+    <w:p/>
+    <w:p>
+      <w:r>
+        <w:t>---</w:t>
+      </w:r>
+    </w:p>
+    <w:p/>
+    <w:p>
+      <w:r>
+        <w:t>## 4. No Guaranteed Results</w:t>
+      </w:r>
+    </w:p>
+    <w:p/>
+    <w:p>
+      <w:r>
+        <w:t>While our products are formulated with quality ingredients, **we do not guarantee specific outcomes**, including but not limited to skin tone changes, texture improvement, or visible results within a defined period.</w:t>
+      </w:r>
+    </w:p>
+    <w:p/>
+    <w:p>
+      <w:r>
+        <w:t>---</w:t>
+      </w:r>
+    </w:p>
+    <w:p/>
+    <w:p>
+      <w:r>
+        <w:t>## 5. Orders &amp; Acceptance</w:t>
+      </w:r>
+    </w:p>
+    <w:p/>
+    <w:p>
+      <w:r>
+        <w:t>All orders placed are subject to acceptance by the Company. We reserve the right to:</w:t>
+      </w:r>
+    </w:p>
+    <w:p/>
+    <w:p>
+      <w:r>
+        <w:t>* Refuse or cancel any order at our sole discretion</w:t>
+      </w:r>
+    </w:p>
+    <w:p>
+      <w:r>
+        <w:t>* Limit quantities per user or order</w:t>
+      </w:r>
+    </w:p>
+    <w:p>
+      <w:r>
+        <w:t>* Cancel orders due to errors in pricing, availability, or suspected fraud</w:t>
+      </w:r>
+    </w:p>
+    <w:p/>
+    <w:p>
+      <w:r>
+        <w:t>---</w:t>
+      </w:r>
+    </w:p>
+    <w:p/>
+    <w:p>
+      <w:r>
+        <w:t>## 6. Pricing &amp; Payments</w:t>
+      </w:r>
+    </w:p>
+    <w:p/>
+    <w:p>
+      <w:r>
+        <w:t>All prices are listed in INR (₹) and may change without prior notice. In case of pricing errors, we reserve the right to cancel orders even after payment.</w:t>
+      </w:r>
+    </w:p>
+    <w:p/>
+    <w:p>
+      <w:r>
+        <w:t>---</w:t>
+      </w:r>
+    </w:p>
+    <w:p/>
+    <w:p>
+      <w:r>
+        <w:t>## 7. Shipping &amp; Delivery</w:t>
+      </w:r>
+    </w:p>
+    <w:p/>
+    <w:p>
+      <w:r>
+        <w:t>Delivery timelines are estimates only. The Company is not responsible for delays caused by logistics partners, natural events, or circumstances beyond our control.</w:t>
+      </w:r>
+    </w:p>
+    <w:p/>
+    <w:p>
+      <w:r>
+        <w:t>Risk of loss transfers to the customer upon dispatch.</w:t>
+      </w:r>
+    </w:p>
+    <w:p/>
+    <w:p>
+      <w:r>
+        <w:t>---</w:t>
+      </w:r>
+    </w:p>
+    <w:p/>
+    <w:p>
+      <w:r>
+        <w:t>## 8. Returns, Refunds &amp; Liability Limitation</w:t>
+      </w:r>
+    </w:p>
+    <w:p/>
+    <w:p>
+      <w:r>
+        <w:t>* Returns are accepted only for **damaged, defective, or incorrect products**, subject to verification</w:t>
+      </w:r>
+    </w:p>
+    <w:p>
+      <w:r>
+        <w:t>* Claims must be made within [7] days of delivery with proof</w:t>
+      </w:r>
+    </w:p>
+    <w:p>
+      <w:r>
+        <w:t>* No returns for opened or used products (for hygiene reasons)</w:t>
+      </w:r>
+    </w:p>
+    <w:p/>
+    <w:p>
+      <w:r>
+        <w:lastRenderedPageBreak/>
+        <w:t>To the maximum extent permitted by law:</w:t>
+      </w:r>
+    </w:p>
+    <w:p/>
+    <w:p>
+      <w:r>
+        <w:t>* The Company’s liability shall **not exceed the purchase value of the product**</w:t>
+      </w:r>
+    </w:p>
+    <w:p>
+      <w:r>
+        <w:t>* We shall not be liable for indirect, incidental, or consequential damages</w:t>
+      </w:r>
+    </w:p>
+    <w:p/>
+    <w:p>
+      <w:r>
+        <w:t>---</w:t>
+      </w:r>
+    </w:p>
+    <w:p/>
+    <w:p>
+      <w:r>
+        <w:t>## 9. Intellectual Property</w:t>
+      </w:r>
+    </w:p>
+    <w:p/>
+    <w:p>
+      <w:r>
+        <w:t>All content including text, branding, logos, product names, designs, and images are the exclusive property of Feather White. Unauthorized use, reproduction, or distribution is strictly prohibited.</w:t>
+      </w:r>
+    </w:p>
+    <w:p/>
+    <w:p>
+      <w:r>
+        <w:t>---</w:t>
+      </w:r>
+    </w:p>
+    <w:p/>
+    <w:p>
+      <w:r>
+        <w:t>## 10. Third-Party Links</w:t>
+      </w:r>
+    </w:p>
+    <w:p/>
+    <w:p>
+      <w:r>
+        <w:t>Our website may contain links to third-party websites. We do not control or endorse their content and are not responsible for any loss or damage arising from their use.</w:t>
+      </w:r>
+    </w:p>
+    <w:p/>
+    <w:p>
+      <w:r>
+        <w:t>---</w:t>
+      </w:r>
+    </w:p>
+    <w:p/>
+    <w:p>
+      <w:r>
+        <w:t>## 11. Indemnity</w:t>
+      </w:r>
+    </w:p>
+    <w:p/>
+    <w:p>
+      <w:r>
+        <w:t>You agree to indemnify and hold harmless Feather White, its owners, employees, and affiliates from any claims, damages, liabilities, or expenses arising from:</w:t>
+      </w:r>
+    </w:p>
+    <w:p/>
+    <w:p>
+      <w:r>
+        <w:t>* Misuse of products</w:t>
+      </w:r>
+    </w:p>
+    <w:p>
+      <w:r>
+        <w:t>* Violation of these Terms</w:t>
+      </w:r>
+    </w:p>
+    <w:p>
+      <w:r>
+        <w:t>* Breach of applicable laws</w:t>
+      </w:r>
+    </w:p>
+    <w:p/>
+    <w:p>
+      <w:r>
+        <w:t>---</w:t>
+      </w:r>
+    </w:p>
+    <w:p/>
+    <w:p>
+      <w:r>
+        <w:t>## 12. Force Majeure</w:t>
+      </w:r>
+    </w:p>
+    <w:p/>
+    <w:p>
+      <w:r>
+        <w:lastRenderedPageBreak/>
+        <w:t>The Company shall not be liable for failure or delay in performance due to events beyond reasonable control, including natural disasters, strikes, government actions, or technical failures.</w:t>
+      </w:r>
+    </w:p>
+    <w:p/>
+    <w:p>
+      <w:r>
+        <w:t>---</w:t>
+      </w:r>
+    </w:p>
+    <w:p/>
+    <w:p>
+      <w:r>
+        <w:t>## 13. Privacy</w:t>
+      </w:r>
+    </w:p>
+    <w:p/>
+    <w:p>
+      <w:r>
+        <w:t>Your use of the website is also governed by our Privacy Policy. By using our website, you consent to the collection and use of your information as described therein.</w:t>
+      </w:r>
+    </w:p>
+    <w:p/>
+    <w:p>
+      <w:r>
+        <w:t>---</w:t>
+      </w:r>
+    </w:p>
+    <w:p/>
+    <w:p>
+      <w:r>
+        <w:t>## 14. Modifications to Terms</w:t>
+      </w:r>
+    </w:p>
+    <w:p/>
+    <w:p>
+      <w:r>
+        <w:t>We reserve the right to update, modify, or replace these Terms at any time without prior notice. Continued use of the website constitutes acceptance of revised Terms.</w:t>
+      </w:r>
+    </w:p>
+    <w:p/>
+    <w:p>
+      <w:r>
+        <w:t>---</w:t>
+      </w:r>
+    </w:p>
+    <w:p/>
+    <w:p>
+      <w:r>
+        <w:t>## 15. Governing Law &amp; Jurisdiction</w:t>
+      </w:r>
+    </w:p>
+    <w:p/>
+    <w:p>
+      <w:r>
+        <w:t>These Terms shall be governed by the laws of India. Any disputes shall be subject to the exclusive jurisdiction of courts in Mumbai, Maharashtra.</w:t>
+      </w:r>
+    </w:p>
+    <w:p/>
+    <w:p>
+      <w:r>
+        <w:t>---</w:t>
+      </w:r>
+    </w:p>
+    <w:p/>
+    <w:p>
+      <w:r>
+        <w:t>## 16. Contact Information</w:t>
+      </w:r>
+    </w:p>
+    <w:p/>
+    <w:p>
+      <w:r>
+        <w:t>For any queries regarding these Terms, please contact:</w:t>
+      </w:r>
+    </w:p>
+    <w:p>
+      <w:r>
+        <w:t>**Email:** care@featherwhiteworld.com</w:t>
+      </w:r>
+    </w:p>
+    <w:p/>
+    <w:p>
+      <w:r>
+        <w:t>---</w:t>
+      </w:r>
+    </w:p>
+    <w:p/>
+    <w:p>
+      <w:r>
+        <w:t>By using this website, you acknowledge that you have read, understood, and agreed to these Terms.</w:t>
+      </w:r>
+    </w:p>
+    <w:p>
+      <w:r>
+        <w:rPr>
+          <w:b/>
+          <w:bCs/>
+        </w:rPr>
+        <w:lastRenderedPageBreak/>
         <w:t>Nature's Finest Ingredients</w:t>
       </w:r>
     </w:p>
@@ -288,7 +751,6 @@
           <w:lang w:eastAsia="en-GB"/>
           <w14:ligatures w14:val="none"/>
         </w:rPr>
-        <w:lastRenderedPageBreak/>
         <w:t>Brand Name:</w:t>
       </w:r>
       <w:r>
@@ -688,6 +1150,7 @@
           <w:b/>
           <w:bCs/>
         </w:rPr>
+        <w:lastRenderedPageBreak/>
         <w:t>Product Detail: Rich descriptions, ingredients list, and "Add to Cart."</w:t>
       </w:r>
     </w:p>
@@ -1002,7 +1465,6 @@
           <w:b/>
           <w:bCs/>
         </w:rPr>
-        <w:lastRenderedPageBreak/>
         <w:t>Styling: Use Tailwind CSS for responsive design.</w:t>
       </w:r>
     </w:p>
@@ -1049,6 +1511,168 @@
         <w:rPr>
           <w:b/>
           <w:bCs/>
+          <w:lang w:val="nb-NO"/>
+        </w:rPr>
+      </w:pPr>
+      <w:r>
+        <w:rPr>
+          <w:b/>
+          <w:bCs/>
+          <w:lang w:val="nb-NO"/>
+        </w:rPr>
+        <w:t xml:space="preserve">Render </w:t>
+      </w:r>
+      <w:r>
+        <w:rPr>
+          <w:b/>
+          <w:bCs/>
+          <w:lang w:val="nb-NO"/>
+        </w:rPr>
+        <w:t>https://</w:t>
+      </w:r>
+      <w:r>
+        <w:rPr>
+          <w:b/>
+          <w:bCs/>
+          <w:lang w:val="nb-NO"/>
+        </w:rPr>
+        <w:t xml:space="preserve"> </w:t>
+      </w:r>
+      <w:r>
+        <w:rPr>
+          <w:b/>
+          <w:bCs/>
+          <w:lang w:val="nb-NO"/>
+        </w:rPr>
+        <w:t>render.com</w:t>
+      </w:r>
+      <w:r>
+        <w:rPr>
+          <w:b/>
+          <w:bCs/>
+          <w:lang w:val="nb-NO"/>
+        </w:rPr>
+        <w:t xml:space="preserve"> fo</w:t>
+      </w:r>
+      <w:r>
+        <w:rPr>
+          <w:b/>
+          <w:bCs/>
+          <w:lang w:val="nb-NO"/>
+        </w:rPr>
+        <w:t>r password security</w:t>
+      </w:r>
+    </w:p>
+    <w:p>
+      <w:pPr>
+        <w:rPr>
+          <w:b/>
+          <w:bCs/>
+        </w:rPr>
+      </w:pPr>
+      <w:r>
+        <w:rPr>
+          <w:b/>
+          <w:bCs/>
+        </w:rPr>
+        <w:t>Mong</w:t>
+      </w:r>
+      <w:r>
+        <w:rPr>
+          <w:b/>
+          <w:bCs/>
+        </w:rPr>
+        <w:t xml:space="preserve">o DB : </w:t>
+      </w:r>
+      <w:r>
+        <w:rPr>
+          <w:b/>
+          <w:bCs/>
+        </w:rPr>
+        <w:t xml:space="preserve">https:// </w:t>
+      </w:r>
+      <w:r>
+        <w:rPr>
+          <w:b/>
+          <w:bCs/>
+        </w:rPr>
+        <w:t>mongodb</w:t>
+      </w:r>
+      <w:r>
+        <w:rPr>
+          <w:b/>
+          <w:bCs/>
+        </w:rPr>
+        <w:t xml:space="preserve">.com for </w:t>
+      </w:r>
+      <w:r>
+        <w:rPr>
+          <w:b/>
+          <w:bCs/>
+        </w:rPr>
+        <w:t>network access</w:t>
+      </w:r>
+    </w:p>
+    <w:p>
+      <w:pPr>
+        <w:rPr>
+          <w:b/>
+          <w:bCs/>
+        </w:rPr>
+      </w:pPr>
+      <w:r>
+        <w:rPr>
+          <w:b/>
+          <w:bCs/>
+        </w:rPr>
+        <w:t>Resend</w:t>
+      </w:r>
+      <w:r>
+        <w:rPr>
+          <w:b/>
+          <w:bCs/>
+        </w:rPr>
+        <w:t xml:space="preserve">: </w:t>
+      </w:r>
+      <w:hyperlink r:id="rId5" w:history="1">
+        <w:r>
+          <w:rPr>
+            <w:rStyle w:val="Hyperlink"/>
+            <w:b/>
+            <w:bCs/>
+          </w:rPr>
+          <w:t>https://</w:t>
+        </w:r>
+        <w:r>
+          <w:rPr>
+            <w:rStyle w:val="Hyperlink"/>
+            <w:b/>
+            <w:bCs/>
+          </w:rPr>
+          <w:t>resend</w:t>
+        </w:r>
+        <w:r>
+          <w:rPr>
+            <w:rStyle w:val="Hyperlink"/>
+            <w:b/>
+            <w:bCs/>
+          </w:rPr>
+          <w:t>.com/</w:t>
+        </w:r>
+      </w:hyperlink>
+      <w:r>
+        <w:rPr>
+          <w:b/>
+          <w:bCs/>
+        </w:rPr>
+        <w:t xml:space="preserve"> email service provider free</w:t>
+      </w:r>
+    </w:p>
+    <w:p>
+      <w:pPr>
+        <w:rPr>
+          <w:b/>
+          <w:bCs/>
         </w:rPr>
       </w:pPr>
     </w:p>
@@ -1087,7 +1711,7 @@
         </w:rPr>
         <w:t xml:space="preserve"> email used is </w:t>
       </w:r>
-      <w:hyperlink r:id="rId5" w:history="1">
+      <w:hyperlink r:id="rId6" w:history="1">
         <w:r>
           <w:rPr>
             <w:rStyle w:val="Hyperlink"/>
@@ -1115,7 +1739,7 @@
       <w:r>
         <w:t xml:space="preserve"> </w:t>
       </w:r>
-      <w:hyperlink r:id="rId6" w:history="1">
+      <w:hyperlink r:id="rId7" w:history="1">
         <w:r>
           <w:rPr>
             <w:rStyle w:val="Hyperlink"/>
@@ -1138,6 +1762,7 @@
           <w:b/>
           <w:bCs/>
         </w:rPr>
+        <w:lastRenderedPageBreak/>
         <w:t>Pw: 123456</w:t>
       </w:r>
     </w:p>
@@ -1163,13 +1788,24 @@
           <w:bCs/>
         </w:rPr>
       </w:pPr>
-      <w:r>
-        <w:rPr>
-          <w:b/>
-          <w:bCs/>
-        </w:rPr>
-        <w:t>https://console.cloud.google.com/</w:t>
-      </w:r>
+      <w:hyperlink r:id="rId8" w:history="1">
+        <w:r>
+          <w:rPr>
+            <w:rStyle w:val="Hyperlink"/>
+            <w:b/>
+            <w:bCs/>
+          </w:rPr>
+          <w:t>https://console.cloud.google.com/</w:t>
+        </w:r>
+      </w:hyperlink>
+    </w:p>
+    <w:p>
+      <w:pPr>
+        <w:rPr>
+          <w:b/>
+          <w:bCs/>
+        </w:rPr>
+      </w:pPr>
     </w:p>
     <w:sectPr>
       <w:pgSz w:w="11906" w:h="16838"/>
@@ -2700,7 +3336,6 @@
   <w:style w:type="character" w:default="1" w:styleId="DefaultParagraphFont">
     <w:name w:val="Default Paragraph Font"/>
     <w:uiPriority w:val="1"/>
-    <w:semiHidden/>
     <w:unhideWhenUsed/>
   </w:style>
   <w:style w:type="table" w:default="1" w:styleId="TableNormal">

</xml_diff>